<commit_message>
Update Proyecto_Transversal - avance 2.docx
</commit_message>
<xml_diff>
--- a/docs/Proyecto_Transversal - avance 2.docx
+++ b/docs/Proyecto_Transversal - avance 2.docx
@@ -167,18 +167,8 @@
           <w:sz w:val="24"/>
           <w:szCs w:val="24"/>
         </w:rPr>
-        <w:t xml:space="preserve">El repositorio se encuentra disponible y fue habilitado a los usuarios de @guscastilloa y @juanjo-edm, el nombre del repositorio es: </w:t>
-      </w:r>
-      <w:proofErr w:type="spellStart"/>
-      <w:r>
-        <w:rPr>
-          <w:rFonts w:ascii="Arial" w:hAnsi="Arial" w:cs="Arial"/>
-          <w:sz w:val="24"/>
-          <w:szCs w:val="24"/>
-        </w:rPr>
-        <w:t>HybridWorking_GPI</w:t>
-      </w:r>
-      <w:proofErr w:type="spellEnd"/>
+        <w:t>El repositorio se encuentra disponible y fue habilitado a los usuarios de @guscastilloa y @juanjo-edm, el nombre del repositorio es: HybridWorking_GPI</w:t>
+      </w:r>
     </w:p>
     <w:p>
       <w:pPr>
@@ -246,107 +236,7 @@
           <w:szCs w:val="24"/>
           <w:lang w:val="en-US"/>
         </w:rPr>
-        <w:t xml:space="preserve">Se </w:t>
-      </w:r>
-      <w:proofErr w:type="spellStart"/>
-      <w:r>
-        <w:rPr>
-          <w:rFonts w:ascii="Arial" w:hAnsi="Arial" w:cs="Arial"/>
-          <w:sz w:val="24"/>
-          <w:szCs w:val="24"/>
-          <w:lang w:val="en-US"/>
-        </w:rPr>
-        <w:t>selecciono</w:t>
-      </w:r>
-      <w:proofErr w:type="spellEnd"/>
-      <w:r>
-        <w:rPr>
-          <w:rFonts w:ascii="Arial" w:hAnsi="Arial" w:cs="Arial"/>
-          <w:sz w:val="24"/>
-          <w:szCs w:val="24"/>
-          <w:lang w:val="en-US"/>
-        </w:rPr>
-        <w:t xml:space="preserve"> </w:t>
-      </w:r>
-      <w:proofErr w:type="spellStart"/>
-      <w:r>
-        <w:rPr>
-          <w:rFonts w:ascii="Arial" w:hAnsi="Arial" w:cs="Arial"/>
-          <w:sz w:val="24"/>
-          <w:szCs w:val="24"/>
-          <w:lang w:val="en-US"/>
-        </w:rPr>
-        <w:t>el</w:t>
-      </w:r>
-      <w:proofErr w:type="spellEnd"/>
-      <w:r>
-        <w:rPr>
-          <w:rFonts w:ascii="Arial" w:hAnsi="Arial" w:cs="Arial"/>
-          <w:sz w:val="24"/>
-          <w:szCs w:val="24"/>
-          <w:lang w:val="en-US"/>
-        </w:rPr>
-        <w:t xml:space="preserve"> paper “Hybrid working from home improves retention without damaging performance” </w:t>
-      </w:r>
-      <w:proofErr w:type="spellStart"/>
-      <w:r>
-        <w:rPr>
-          <w:rFonts w:ascii="Arial" w:hAnsi="Arial" w:cs="Arial"/>
-          <w:sz w:val="24"/>
-          <w:szCs w:val="24"/>
-          <w:lang w:val="en-US"/>
-        </w:rPr>
-        <w:t>realizadó</w:t>
-      </w:r>
-      <w:proofErr w:type="spellEnd"/>
-      <w:r>
-        <w:rPr>
-          <w:rFonts w:ascii="Arial" w:hAnsi="Arial" w:cs="Arial"/>
-          <w:sz w:val="24"/>
-          <w:szCs w:val="24"/>
-          <w:lang w:val="en-US"/>
-        </w:rPr>
-        <w:t xml:space="preserve"> </w:t>
-      </w:r>
-      <w:proofErr w:type="spellStart"/>
-      <w:r>
-        <w:rPr>
-          <w:rFonts w:ascii="Arial" w:hAnsi="Arial" w:cs="Arial"/>
-          <w:sz w:val="24"/>
-          <w:szCs w:val="24"/>
-          <w:lang w:val="en-US"/>
-        </w:rPr>
-        <w:t>por</w:t>
-      </w:r>
-      <w:proofErr w:type="spellEnd"/>
-      <w:r>
-        <w:rPr>
-          <w:rFonts w:ascii="Arial" w:hAnsi="Arial" w:cs="Arial"/>
-          <w:sz w:val="24"/>
-          <w:szCs w:val="24"/>
-          <w:lang w:val="en-US"/>
-        </w:rPr>
-        <w:t xml:space="preserve"> Bloom, N., Han, R., &amp; Liang, J. </w:t>
-      </w:r>
-      <w:proofErr w:type="spellStart"/>
-      <w:r>
-        <w:rPr>
-          <w:rFonts w:ascii="Arial" w:hAnsi="Arial" w:cs="Arial"/>
-          <w:sz w:val="24"/>
-          <w:szCs w:val="24"/>
-          <w:lang w:val="en-US"/>
-        </w:rPr>
-        <w:t>en</w:t>
-      </w:r>
-      <w:proofErr w:type="spellEnd"/>
-      <w:r>
-        <w:rPr>
-          <w:rFonts w:ascii="Arial" w:hAnsi="Arial" w:cs="Arial"/>
-          <w:sz w:val="24"/>
-          <w:szCs w:val="24"/>
-          <w:lang w:val="en-US"/>
-        </w:rPr>
-        <w:t xml:space="preserve"> 2024. </w:t>
+        <w:t xml:space="preserve">Se selecciono el paper “Hybrid working from home improves retention without damaging performance” realizadó por Bloom, N., Han, R., &amp; Liang, J. en 2024. </w:t>
       </w:r>
       <w:r>
         <w:rPr>
@@ -370,97 +260,25 @@
           <w:sz w:val="24"/>
           <w:szCs w:val="24"/>
         </w:rPr>
-        <w:t xml:space="preserve"> porque es el actual esquema de trabajo de los integrantes que elaboran el presente documento y cada uno percibe beneficios en productividad, satisfacción laboral, movilidad y balance de vida personal – laboral. No obstante, existe debate al respecto en cuanto a ventajas y desventajas de esta modalidad entre empresas, empleados y demás agentes de </w:t>
-      </w:r>
-      <w:proofErr w:type="spellStart"/>
-      <w:r>
-        <w:rPr>
-          <w:rFonts w:ascii="Arial" w:hAnsi="Arial" w:cs="Arial"/>
-          <w:sz w:val="24"/>
-          <w:szCs w:val="24"/>
-        </w:rPr>
-        <w:t>interes</w:t>
-      </w:r>
-      <w:proofErr w:type="spellEnd"/>
-      <w:r>
-        <w:rPr>
-          <w:rFonts w:ascii="Arial" w:hAnsi="Arial" w:cs="Arial"/>
-          <w:sz w:val="24"/>
-          <w:szCs w:val="24"/>
-        </w:rPr>
-        <w:t xml:space="preserve">. Como estudiantes de la MECA es de </w:t>
-      </w:r>
-      <w:proofErr w:type="spellStart"/>
-      <w:r>
-        <w:rPr>
-          <w:rFonts w:ascii="Arial" w:hAnsi="Arial" w:cs="Arial"/>
-          <w:sz w:val="24"/>
-          <w:szCs w:val="24"/>
-        </w:rPr>
-        <w:t>interes</w:t>
-      </w:r>
-      <w:proofErr w:type="spellEnd"/>
-      <w:r>
-        <w:rPr>
-          <w:rFonts w:ascii="Arial" w:hAnsi="Arial" w:cs="Arial"/>
-          <w:sz w:val="24"/>
-          <w:szCs w:val="24"/>
-        </w:rPr>
-        <w:t xml:space="preserve"> conocer la metodología usada en el artículo y replicarlo para probar dichos impactos ya sean positivos o negativos del trabajo en modalidad hibrida y demostrarlos de manera </w:t>
-      </w:r>
-      <w:proofErr w:type="spellStart"/>
-      <w:r>
-        <w:rPr>
-          <w:rFonts w:ascii="Arial" w:hAnsi="Arial" w:cs="Arial"/>
-          <w:sz w:val="24"/>
-          <w:szCs w:val="24"/>
-        </w:rPr>
-        <w:t>cuatificada</w:t>
-      </w:r>
-      <w:proofErr w:type="spellEnd"/>
-      <w:r>
-        <w:rPr>
-          <w:rFonts w:ascii="Arial" w:hAnsi="Arial" w:cs="Arial"/>
-          <w:sz w:val="24"/>
-          <w:szCs w:val="24"/>
-        </w:rPr>
-        <w:t>.</w:t>
-      </w:r>
-    </w:p>
-    <w:p>
-      <w:pPr>
-        <w:jc w:val="both"/>
-        <w:rPr>
-          <w:rFonts w:ascii="Arial" w:hAnsi="Arial" w:cs="Arial"/>
-          <w:sz w:val="24"/>
-          <w:szCs w:val="24"/>
-        </w:rPr>
-      </w:pPr>
-      <w:r>
-        <w:rPr>
-          <w:rFonts w:ascii="Arial" w:hAnsi="Arial" w:cs="Arial"/>
-          <w:sz w:val="24"/>
-          <w:szCs w:val="24"/>
-        </w:rPr>
-        <w:t xml:space="preserve">Este tema es relevante para los trabajadores en Colombia puesto que la modalidad hibrida se encuentra en auge y ya amparada por la Ley 2466 de 2025. La cuarta edición de la encuesta EY Work </w:t>
-      </w:r>
-      <w:proofErr w:type="spellStart"/>
-      <w:r>
-        <w:rPr>
-          <w:rFonts w:ascii="Arial" w:hAnsi="Arial" w:cs="Arial"/>
-          <w:sz w:val="24"/>
-          <w:szCs w:val="24"/>
-        </w:rPr>
-        <w:t>Reimagined</w:t>
-      </w:r>
-      <w:proofErr w:type="spellEnd"/>
-      <w:r>
-        <w:rPr>
-          <w:rFonts w:ascii="Arial" w:hAnsi="Arial" w:cs="Arial"/>
-          <w:sz w:val="24"/>
-          <w:szCs w:val="24"/>
-        </w:rPr>
-        <w:t xml:space="preserve"> de 2024 revelo que en Colombia el 90% de los colombianos prefiere un esquema de trabajo híbrido, con al menos 2 días de trabajo remoto; no obstante, también reveló que la conexión social es una de las principales razones por las que desean asistir al lugar de trabajo. </w:t>
+        <w:t xml:space="preserve"> porque es el actual esquema de trabajo de los integrantes que elaboran el presente documento y cada uno percibe beneficios en productividad, satisfacción laboral, movilidad y balance de vida personal – laboral. No obstante, existe debate al respecto en cuanto a ventajas y desventajas de esta modalidad entre empresas, empleados y demás agentes de interes. Como estudiantes de la MECA es de interes conocer la metodología usada en el artículo y replicarlo para probar dichos impactos ya sean positivos o negativos del trabajo en modalidad hibrida y demostrarlos de manera cuatificada.</w:t>
+      </w:r>
+    </w:p>
+    <w:p>
+      <w:pPr>
+        <w:jc w:val="both"/>
+        <w:rPr>
+          <w:rFonts w:ascii="Arial" w:hAnsi="Arial" w:cs="Arial"/>
+          <w:sz w:val="24"/>
+          <w:szCs w:val="24"/>
+        </w:rPr>
+      </w:pPr>
+      <w:r>
+        <w:rPr>
+          <w:rFonts w:ascii="Arial" w:hAnsi="Arial" w:cs="Arial"/>
+          <w:sz w:val="24"/>
+          <w:szCs w:val="24"/>
+        </w:rPr>
+        <w:t xml:space="preserve">Este tema es relevante para los trabajadores en Colombia puesto que la modalidad hibrida se encuentra en auge y ya amparada por la Ley 2466 de 2025. La cuarta edición de la encuesta EY Work Reimagined de 2024 revelo que en Colombia el 90% de los colombianos prefiere un esquema de trabajo híbrido, con al menos 2 días de trabajo remoto; no obstante, también reveló que la conexión social es una de las principales razones por las que desean asistir al lugar de trabajo. </w:t>
       </w:r>
     </w:p>
     <w:p>
@@ -821,9 +639,8 @@
           <w:sz w:val="24"/>
           <w:szCs w:val="24"/>
         </w:rPr>
-        <w:t xml:space="preserve">Hybrid </w:t>
-      </w:r>
-      <w:proofErr w:type="spellStart"/>
+        <w:t xml:space="preserve">Hybrid working from home improves </w:t>
+      </w:r>
       <w:r>
         <w:rPr>
           <w:rFonts w:ascii="Arial" w:hAnsi="Arial" w:cs="Arial"/>
@@ -832,129 +649,8 @@
           <w:sz w:val="24"/>
           <w:szCs w:val="24"/>
         </w:rPr>
-        <w:t>working</w:t>
-      </w:r>
-      <w:proofErr w:type="spellEnd"/>
-      <w:r>
-        <w:rPr>
-          <w:rFonts w:ascii="Arial" w:hAnsi="Arial" w:cs="Arial"/>
-          <w:i/>
-          <w:iCs/>
-          <w:sz w:val="24"/>
-          <w:szCs w:val="24"/>
-        </w:rPr>
-        <w:t xml:space="preserve"> </w:t>
-      </w:r>
-      <w:proofErr w:type="spellStart"/>
-      <w:r>
-        <w:rPr>
-          <w:rFonts w:ascii="Arial" w:hAnsi="Arial" w:cs="Arial"/>
-          <w:i/>
-          <w:iCs/>
-          <w:sz w:val="24"/>
-          <w:szCs w:val="24"/>
-        </w:rPr>
-        <w:t>from</w:t>
-      </w:r>
-      <w:proofErr w:type="spellEnd"/>
-      <w:r>
-        <w:rPr>
-          <w:rFonts w:ascii="Arial" w:hAnsi="Arial" w:cs="Arial"/>
-          <w:i/>
-          <w:iCs/>
-          <w:sz w:val="24"/>
-          <w:szCs w:val="24"/>
-        </w:rPr>
-        <w:t xml:space="preserve"> home </w:t>
-      </w:r>
-      <w:proofErr w:type="spellStart"/>
-      <w:r>
-        <w:rPr>
-          <w:rFonts w:ascii="Arial" w:hAnsi="Arial" w:cs="Arial"/>
-          <w:i/>
-          <w:iCs/>
-          <w:sz w:val="24"/>
-          <w:szCs w:val="24"/>
-        </w:rPr>
-        <w:t>improves</w:t>
-      </w:r>
-      <w:proofErr w:type="spellEnd"/>
-      <w:r>
-        <w:rPr>
-          <w:rFonts w:ascii="Arial" w:hAnsi="Arial" w:cs="Arial"/>
-          <w:i/>
-          <w:iCs/>
-          <w:sz w:val="24"/>
-          <w:szCs w:val="24"/>
-        </w:rPr>
-        <w:t xml:space="preserve"> </w:t>
-      </w:r>
-      <w:proofErr w:type="spellStart"/>
-      <w:r>
-        <w:rPr>
-          <w:rFonts w:ascii="Arial" w:hAnsi="Arial" w:cs="Arial"/>
-          <w:i/>
-          <w:iCs/>
-          <w:sz w:val="24"/>
-          <w:szCs w:val="24"/>
-        </w:rPr>
         <w:lastRenderedPageBreak/>
-        <w:t>retention</w:t>
-      </w:r>
-      <w:proofErr w:type="spellEnd"/>
-      <w:r>
-        <w:rPr>
-          <w:rFonts w:ascii="Arial" w:hAnsi="Arial" w:cs="Arial"/>
-          <w:i/>
-          <w:iCs/>
-          <w:sz w:val="24"/>
-          <w:szCs w:val="24"/>
-        </w:rPr>
-        <w:t xml:space="preserve"> </w:t>
-      </w:r>
-      <w:proofErr w:type="spellStart"/>
-      <w:r>
-        <w:rPr>
-          <w:rFonts w:ascii="Arial" w:hAnsi="Arial" w:cs="Arial"/>
-          <w:i/>
-          <w:iCs/>
-          <w:sz w:val="24"/>
-          <w:szCs w:val="24"/>
-        </w:rPr>
-        <w:t>without</w:t>
-      </w:r>
-      <w:proofErr w:type="spellEnd"/>
-      <w:r>
-        <w:rPr>
-          <w:rFonts w:ascii="Arial" w:hAnsi="Arial" w:cs="Arial"/>
-          <w:i/>
-          <w:iCs/>
-          <w:sz w:val="24"/>
-          <w:szCs w:val="24"/>
-        </w:rPr>
-        <w:t xml:space="preserve"> </w:t>
-      </w:r>
-      <w:proofErr w:type="spellStart"/>
-      <w:r>
-        <w:rPr>
-          <w:rFonts w:ascii="Arial" w:hAnsi="Arial" w:cs="Arial"/>
-          <w:i/>
-          <w:iCs/>
-          <w:sz w:val="24"/>
-          <w:szCs w:val="24"/>
-        </w:rPr>
-        <w:t>damaging</w:t>
-      </w:r>
-      <w:proofErr w:type="spellEnd"/>
-      <w:r>
-        <w:rPr>
-          <w:rFonts w:ascii="Arial" w:hAnsi="Arial" w:cs="Arial"/>
-          <w:i/>
-          <w:iCs/>
-          <w:sz w:val="24"/>
-          <w:szCs w:val="24"/>
-        </w:rPr>
-        <w:t xml:space="preserve"> performance</w:t>
+        <w:t>retention without damaging performance</w:t>
       </w:r>
       <w:r>
         <w:rPr>
@@ -978,51 +674,15 @@
           <w:sz w:val="24"/>
           <w:szCs w:val="24"/>
         </w:rPr>
-        <w:t xml:space="preserve">mediante el DOI </w:t>
-      </w:r>
-      <w:proofErr w:type="spellStart"/>
-      <w:r>
-        <w:rPr>
-          <w:rFonts w:ascii="Arial" w:hAnsi="Arial" w:cs="Arial"/>
-          <w:sz w:val="24"/>
-          <w:szCs w:val="24"/>
-        </w:rPr>
-        <w:t>paper</w:t>
-      </w:r>
-      <w:proofErr w:type="spellEnd"/>
-      <w:r>
-        <w:rPr>
-          <w:rFonts w:ascii="Arial" w:hAnsi="Arial" w:cs="Arial"/>
-          <w:sz w:val="24"/>
-          <w:szCs w:val="24"/>
-        </w:rPr>
-        <w:t xml:space="preserve">: </w:t>
-      </w:r>
-      <w:r>
-        <w:rPr>
-          <w:rFonts w:ascii="Arial" w:hAnsi="Arial" w:cs="Arial"/>
-          <w:sz w:val="24"/>
-          <w:szCs w:val="24"/>
-        </w:rPr>
-        <w:t xml:space="preserve">DOI </w:t>
-      </w:r>
-      <w:proofErr w:type="spellStart"/>
-      <w:r>
-        <w:rPr>
-          <w:rFonts w:ascii="Arial" w:hAnsi="Arial" w:cs="Arial"/>
-          <w:sz w:val="24"/>
-          <w:szCs w:val="24"/>
-        </w:rPr>
-        <w:t>paper</w:t>
-      </w:r>
-      <w:proofErr w:type="spellEnd"/>
-      <w:r>
-        <w:rPr>
-          <w:rFonts w:ascii="Arial" w:hAnsi="Arial" w:cs="Arial"/>
-          <w:sz w:val="24"/>
-          <w:szCs w:val="24"/>
-        </w:rPr>
-        <w:t>: 10.1038/s41586-024-07500-2</w:t>
+        <w:t xml:space="preserve">mediante el DOI paper: </w:t>
+      </w:r>
+      <w:r>
+        <w:rPr>
+          <w:rFonts w:ascii="Arial" w:hAnsi="Arial" w:cs="Arial"/>
+          <w:sz w:val="24"/>
+          <w:szCs w:val="24"/>
+        </w:rPr>
+        <w:t>DOI paper: 10.1038/s41586-024-07500-2</w:t>
       </w:r>
       <w:r>
         <w:rPr>
@@ -1486,79 +1146,7 @@
           <w:sz w:val="24"/>
           <w:szCs w:val="24"/>
         </w:rPr>
-        <w:t xml:space="preserve">La reproducción se desarrolló en Python. Los archivos revisados muestran el uso de librerías como pandas para manejo de datos, </w:t>
-      </w:r>
-      <w:proofErr w:type="spellStart"/>
-      <w:r>
-        <w:rPr>
-          <w:rFonts w:ascii="Arial" w:hAnsi="Arial" w:cs="Arial"/>
-          <w:sz w:val="24"/>
-          <w:szCs w:val="24"/>
-        </w:rPr>
-        <w:t>matplotlib</w:t>
-      </w:r>
-      <w:proofErr w:type="spellEnd"/>
-      <w:r>
-        <w:rPr>
-          <w:rFonts w:ascii="Arial" w:hAnsi="Arial" w:cs="Arial"/>
-          <w:sz w:val="24"/>
-          <w:szCs w:val="24"/>
-        </w:rPr>
-        <w:t xml:space="preserve"> para la construcción de la figura, </w:t>
-      </w:r>
-      <w:proofErr w:type="spellStart"/>
-      <w:r>
-        <w:rPr>
-          <w:rFonts w:ascii="Arial" w:hAnsi="Arial" w:cs="Arial"/>
-          <w:sz w:val="24"/>
-          <w:szCs w:val="24"/>
-        </w:rPr>
-        <w:t>numpy</w:t>
-      </w:r>
-      <w:proofErr w:type="spellEnd"/>
-      <w:r>
-        <w:rPr>
-          <w:rFonts w:ascii="Arial" w:hAnsi="Arial" w:cs="Arial"/>
-          <w:sz w:val="24"/>
-          <w:szCs w:val="24"/>
-        </w:rPr>
-        <w:t xml:space="preserve"> para apoyo en el manejo de arreglos, </w:t>
-      </w:r>
-      <w:proofErr w:type="spellStart"/>
-      <w:r>
-        <w:rPr>
-          <w:rFonts w:ascii="Arial" w:hAnsi="Arial" w:cs="Arial"/>
-          <w:sz w:val="24"/>
-          <w:szCs w:val="24"/>
-        </w:rPr>
-        <w:t>scipy</w:t>
-      </w:r>
-      <w:proofErr w:type="spellEnd"/>
-      <w:r>
-        <w:rPr>
-          <w:rFonts w:ascii="Arial" w:hAnsi="Arial" w:cs="Arial"/>
-          <w:sz w:val="24"/>
-          <w:szCs w:val="24"/>
-        </w:rPr>
-        <w:t xml:space="preserve"> para el cálculo estadístico y </w:t>
-      </w:r>
-      <w:proofErr w:type="spellStart"/>
-      <w:r>
-        <w:rPr>
-          <w:rFonts w:ascii="Arial" w:hAnsi="Arial" w:cs="Arial"/>
-          <w:sz w:val="24"/>
-          <w:szCs w:val="24"/>
-        </w:rPr>
-        <w:t>requests</w:t>
-      </w:r>
-      <w:proofErr w:type="spellEnd"/>
-      <w:r>
-        <w:rPr>
-          <w:rFonts w:ascii="Arial" w:hAnsi="Arial" w:cs="Arial"/>
-          <w:sz w:val="24"/>
-          <w:szCs w:val="24"/>
-        </w:rPr>
-        <w:t xml:space="preserve"> para la descarga de archivos desde la fuente original. Además, los scripts usan una configuración interna del proyecto para ubicar los datos de entrada y para guardar las salidas en carpetas separadas de tablas y figuras.</w:t>
+        <w:t>La reproducción se desarrolló en Python. Los archivos revisados muestran el uso de librerías como pandas para manejo de datos, matplotlib para la construcción de la figura, numpy para apoyo en el manejo de arreglos, scipy para el cálculo estadístico y requests para la descarga de archivos desde la fuente original. Además, los scripts usan una configuración interna del proyecto para ubicar los datos de entrada y para guardar las salidas en carpetas separadas de tablas y figuras.</w:t>
       </w:r>
     </w:p>
     <w:p>
@@ -1597,25 +1185,7 @@
           <w:sz w:val="24"/>
           <w:szCs w:val="24"/>
         </w:rPr>
-        <w:t xml:space="preserve"> y guarda como salidas una imagen de la figura replicada y una tabla resumen con los valores calculados. También se emplea un modo de trabajo en </w:t>
-      </w:r>
-      <w:proofErr w:type="spellStart"/>
-      <w:r>
-        <w:rPr>
-          <w:rFonts w:ascii="Arial" w:hAnsi="Arial" w:cs="Arial"/>
-          <w:sz w:val="24"/>
-          <w:szCs w:val="24"/>
-        </w:rPr>
-        <w:t>matplotlib</w:t>
-      </w:r>
-      <w:proofErr w:type="spellEnd"/>
-      <w:r>
-        <w:rPr>
-          <w:rFonts w:ascii="Arial" w:hAnsi="Arial" w:cs="Arial"/>
-          <w:sz w:val="24"/>
-          <w:szCs w:val="24"/>
-        </w:rPr>
-        <w:t xml:space="preserve"> que permite guardar figuras directamente en archivos, lo cual facilita la ejecución del proceso dentro del repositorio sin depender de una visualización manual en pantalla.</w:t>
+        <w:t xml:space="preserve"> y guarda como salidas una imagen de la figura replicada y una tabla resumen con los valores calculados. También se emplea un modo de trabajo en matplotlib que permite guardar figuras directamente en archivos, lo cual facilita la ejecución del proceso dentro del repositorio sin depender de una visualización manual en pantalla.</w:t>
       </w:r>
     </w:p>
     <w:p>
@@ -1652,25 +1222,23 @@
           <w:sz w:val="24"/>
           <w:szCs w:val="24"/>
         </w:rPr>
-        <w:t xml:space="preserve">El procesamiento comenzó con la descarga de los archivos necesarios para la figura seleccionada. Para esto se usó un script que resuelve el DOI del material de replicación, identifica si la fuente corresponde a </w:t>
-      </w:r>
-      <w:proofErr w:type="spellStart"/>
-      <w:r>
-        <w:rPr>
-          <w:rFonts w:ascii="Arial" w:hAnsi="Arial" w:cs="Arial"/>
-          <w:sz w:val="24"/>
-          <w:szCs w:val="24"/>
-        </w:rPr>
-        <w:t>Zenodo</w:t>
-      </w:r>
-      <w:proofErr w:type="spellEnd"/>
-      <w:r>
-        <w:rPr>
-          <w:rFonts w:ascii="Arial" w:hAnsi="Arial" w:cs="Arial"/>
-          <w:sz w:val="24"/>
-          <w:szCs w:val="24"/>
-        </w:rPr>
-        <w:t xml:space="preserve"> y aplica un filtro por nombre para ubicar los archivos relacionados con Figure 2. Cuando el archivo descargado viene en formato tabulado, el mismo proceso lo convierte a CSV y lo guarda en la carpeta de datos crudos del proyecto. Esto ayudó a dejar una base de trabajo más uniforme para las siguientes etapas.</w:t>
+        <w:t>El procesamiento comenzó con la descarga de los archivos necesarios para la figura seleccionada. Para esto se usó un script que resuelve el DOI del material de replicación, identifica si la fuente corresponde a</w:t>
+      </w:r>
+      <w:r>
+        <w:rPr>
+          <w:rFonts w:ascii="Arial" w:hAnsi="Arial" w:cs="Arial"/>
+          <w:sz w:val="24"/>
+          <w:szCs w:val="24"/>
+        </w:rPr>
+        <w:t xml:space="preserve"> Dataverse o</w:t>
+      </w:r>
+      <w:r>
+        <w:rPr>
+          <w:rFonts w:ascii="Arial" w:hAnsi="Arial" w:cs="Arial"/>
+          <w:sz w:val="24"/>
+          <w:szCs w:val="24"/>
+        </w:rPr>
+        <w:t xml:space="preserve"> Zenodo y aplica un filtro por nombre para ubicar los archivos relacionados con Figure 2. Cuando el archivo descargado viene en formato tabulado, el mismo proceso lo convierte a CSV y lo guarda en la carpeta de datos crudos del proyecto. Esto ayudó a dejar una base de trabajo más uniforme para las siguientes etapas.</w:t>
       </w:r>
     </w:p>
     <w:p>
@@ -1710,7 +1278,6 @@
         </w:rPr>
         <w:t xml:space="preserve"> y se verificó que estuvieran presentes las columnas necesarias para reconstruir la figura. En particular, el script exige las variables </w:t>
       </w:r>
-      <w:proofErr w:type="spellStart"/>
       <w:r>
         <w:rPr>
           <w:rFonts w:ascii="Arial" w:hAnsi="Arial" w:cs="Arial"/>
@@ -1723,7 +1290,6 @@
         </w:rPr>
         <w:t>treat</w:t>
       </w:r>
-      <w:proofErr w:type="spellEnd"/>
       <w:r>
         <w:rPr>
           <w:rFonts w:ascii="Arial" w:hAnsi="Arial" w:cs="Arial"/>
@@ -1772,7 +1338,6 @@
         </w:rPr>
         <w:t xml:space="preserve">, </w:t>
       </w:r>
-      <w:proofErr w:type="spellStart"/>
       <w:r>
         <w:rPr>
           <w:rFonts w:ascii="Arial" w:hAnsi="Arial" w:cs="Arial"/>
@@ -1785,7 +1350,6 @@
         </w:rPr>
         <w:t>live_far</w:t>
       </w:r>
-      <w:proofErr w:type="spellEnd"/>
       <w:r>
         <w:rPr>
           <w:rFonts w:ascii="Arial" w:hAnsi="Arial" w:cs="Arial"/>
@@ -1794,7 +1358,6 @@
         </w:rPr>
         <w:t xml:space="preserve"> y </w:t>
       </w:r>
-      <w:proofErr w:type="spellStart"/>
       <w:r>
         <w:rPr>
           <w:rFonts w:ascii="Arial" w:hAnsi="Arial" w:cs="Arial"/>
@@ -1807,68 +1370,31 @@
         </w:rPr>
         <w:t>attrite_perc</w:t>
       </w:r>
-      <w:proofErr w:type="spellEnd"/>
-      <w:r>
-        <w:rPr>
-          <w:rFonts w:ascii="Arial" w:hAnsi="Arial" w:cs="Arial"/>
-          <w:sz w:val="24"/>
-          <w:szCs w:val="24"/>
-        </w:rPr>
-        <w:t xml:space="preserve">. Además, se revisa que las variables clave no tengan valores faltantes, que las variables binarias estén codificadas de forma consistente y que el tamaño de la base no se aleje de las 1,612 observaciones esperadas. El código también contempla que la variable de </w:t>
-      </w:r>
-      <w:proofErr w:type="spellStart"/>
-      <w:r>
-        <w:rPr>
-          <w:rFonts w:ascii="Arial" w:hAnsi="Arial" w:cs="Arial"/>
-          <w:sz w:val="24"/>
-          <w:szCs w:val="24"/>
-        </w:rPr>
-        <w:t>attrition</w:t>
-      </w:r>
-      <w:proofErr w:type="spellEnd"/>
-      <w:r>
-        <w:rPr>
-          <w:rFonts w:ascii="Arial" w:hAnsi="Arial" w:cs="Arial"/>
-          <w:sz w:val="24"/>
-          <w:szCs w:val="24"/>
-        </w:rPr>
-        <w:t xml:space="preserve"> pueda venir en escala de 0 a 100, por lo que en ese caso la convierte a una escala entre 0 y 1 antes de continuar con los cálculos.</w:t>
-      </w:r>
-    </w:p>
-    <w:p>
-      <w:pPr>
-        <w:jc w:val="both"/>
-        <w:rPr>
-          <w:rFonts w:ascii="Arial" w:hAnsi="Arial" w:cs="Arial"/>
-          <w:sz w:val="24"/>
-          <w:szCs w:val="24"/>
-        </w:rPr>
-      </w:pPr>
-      <w:r>
-        <w:rPr>
-          <w:rFonts w:ascii="Arial" w:hAnsi="Arial" w:cs="Arial"/>
-          <w:sz w:val="24"/>
-          <w:szCs w:val="24"/>
-        </w:rPr>
-        <w:t xml:space="preserve">Una vez verificada la base, se prepararon etiquetas más legibles para los grupos de comparación. Esto permitió trabajar no solo con la muestra completa de empleados, sino también con los subgrupos que aparecen en la Figura 2. A partir de ahí, las tasas de </w:t>
-      </w:r>
-      <w:proofErr w:type="spellStart"/>
-      <w:r>
-        <w:rPr>
-          <w:rFonts w:ascii="Arial" w:hAnsi="Arial" w:cs="Arial"/>
-          <w:sz w:val="24"/>
-          <w:szCs w:val="24"/>
-        </w:rPr>
-        <w:t>attrition</w:t>
-      </w:r>
-      <w:proofErr w:type="spellEnd"/>
-      <w:r>
-        <w:rPr>
-          <w:rFonts w:ascii="Arial" w:hAnsi="Arial" w:cs="Arial"/>
-          <w:sz w:val="24"/>
-          <w:szCs w:val="24"/>
-        </w:rPr>
-        <w:t xml:space="preserve"> se calcularon como el promedio de la variable binaria de renuncia dentro de cada grupo. El código organiza estos cálculos para la muestra total y para las divisiones por cargo, sexo y tiempo de desplazamiento. Junto con estas tasas, también se generaron valores asociados a la diferencia entre grupo de control y grupo de tratamiento y el valor p correspondiente para cada panel de la figura.</w:t>
+      <w:r>
+        <w:rPr>
+          <w:rFonts w:ascii="Arial" w:hAnsi="Arial" w:cs="Arial"/>
+          <w:sz w:val="24"/>
+          <w:szCs w:val="24"/>
+        </w:rPr>
+        <w:t>. Además, se revisa que las variables clave no tengan valores faltantes, que las variables binarias estén codificadas de forma consistente y que el tamaño de la base no se aleje de las 1,612 observaciones esperadas. El código también contempla que la variable de attrition pueda venir en escala de 0 a 100, por lo que en ese caso la convierte a una escala entre 0 y 1 antes de continuar con los cálculos.</w:t>
+      </w:r>
+    </w:p>
+    <w:p>
+      <w:pPr>
+        <w:jc w:val="both"/>
+        <w:rPr>
+          <w:rFonts w:ascii="Arial" w:hAnsi="Arial" w:cs="Arial"/>
+          <w:sz w:val="24"/>
+          <w:szCs w:val="24"/>
+        </w:rPr>
+      </w:pPr>
+      <w:r>
+        <w:rPr>
+          <w:rFonts w:ascii="Arial" w:hAnsi="Arial" w:cs="Arial"/>
+          <w:sz w:val="24"/>
+          <w:szCs w:val="24"/>
+        </w:rPr>
+        <w:t>Una vez verificada la base, se prepararon etiquetas más legibles para los grupos de comparación. Esto permitió trabajar no solo con la muestra completa de empleados, sino también con los subgrupos que aparecen en la Figura 2. A partir de ahí, las tasas de attrition se calcularon como el promedio de la variable binaria de renuncia dentro de cada grupo. El código organiza estos cálculos para la muestra total y para las divisiones por cargo, sexo y tiempo de desplazamiento. Junto con estas tasas, también se generaron valores asociados a la diferencia entre grupo de control y grupo de tratamiento y el valor p correspondiente para cada panel de la figura.</w:t>
       </w:r>
     </w:p>
     <w:p>
@@ -1906,25 +1432,7 @@
           <w:sz w:val="24"/>
           <w:szCs w:val="24"/>
         </w:rPr>
-        <w:t xml:space="preserve">. De manera adicional, se dejó preparada una etapa de validación que toma la tabla resumen producida por la réplica, la empareja con los valores reportados en el artículo y organiza una tabla comparativa. Esa misma parte también guarda una imagen con las diferencias entre los resultados del </w:t>
-      </w:r>
-      <w:proofErr w:type="spellStart"/>
-      <w:r>
-        <w:rPr>
-          <w:rFonts w:ascii="Arial" w:hAnsi="Arial" w:cs="Arial"/>
-          <w:sz w:val="24"/>
-          <w:szCs w:val="24"/>
-        </w:rPr>
-        <w:t>paper</w:t>
-      </w:r>
-      <w:proofErr w:type="spellEnd"/>
-      <w:r>
-        <w:rPr>
-          <w:rFonts w:ascii="Arial" w:hAnsi="Arial" w:cs="Arial"/>
-          <w:sz w:val="24"/>
-          <w:szCs w:val="24"/>
-        </w:rPr>
-        <w:t xml:space="preserve"> y los resultados reproducidos, lo que facilita el paso posterior de comparación dentro de la sección de resultados y análisis.</w:t>
+        <w:t>. De manera adicional, se dejó preparada una etapa de validación que toma la tabla resumen producida por la réplica, la empareja con los valores reportados en el artículo y organiza una tabla comparativa. Esa misma parte también guarda una imagen con las diferencias entre los resultados del paper y los resultados reproducidos, lo que facilita el paso posterior de comparación dentro de la sección de resultados y análisis.</w:t>
       </w:r>
     </w:p>
     <w:p>
@@ -1988,25 +1496,7 @@
           <w:sz w:val="24"/>
           <w:szCs w:val="24"/>
         </w:rPr>
-        <w:t xml:space="preserve">Otro punto importante fue el formato de los datos. Algunos archivos podían venir en formatos tabulados y no directamente en CSV, por lo que fue necesario incluir una conversión durante la descarga. También era posible que la variable de </w:t>
-      </w:r>
-      <w:proofErr w:type="spellStart"/>
-      <w:r>
-        <w:rPr>
-          <w:rFonts w:ascii="Arial" w:hAnsi="Arial" w:cs="Arial"/>
-          <w:sz w:val="24"/>
-          <w:szCs w:val="24"/>
-        </w:rPr>
-        <w:t>attrition</w:t>
-      </w:r>
-      <w:proofErr w:type="spellEnd"/>
-      <w:r>
-        <w:rPr>
-          <w:rFonts w:ascii="Arial" w:hAnsi="Arial" w:cs="Arial"/>
-          <w:sz w:val="24"/>
-          <w:szCs w:val="24"/>
-        </w:rPr>
-        <w:t xml:space="preserve"> no estuviera en la escala esperada, de modo que el script incorpora una revisión previa para normalizarla antes de hacer cualquier cálculo. Estas verificaciones ayudaron a evitar errores simples que podían afectar los porcentajes finales de la figura.</w:t>
+        <w:t>Otro punto importante fue el formato de los datos. Algunos archivos podían venir en formatos tabulados y no directamente en CSV, por lo que fue necesario incluir una conversión durante la descarga. También era posible que la variable de attrition no estuviera en la escala esperada, de modo que el script incorpora una revisión previa para normalizarla antes de hacer cualquier cálculo. Estas verificaciones ayudaron a evitar errores simples que podían afectar los porcentajes finales de la figura.</w:t>
       </w:r>
     </w:p>
     <w:p>
@@ -2042,25 +1532,7 @@
           <w:sz w:val="24"/>
           <w:szCs w:val="24"/>
         </w:rPr>
-        <w:t xml:space="preserve">Por último, otro reto fue mantener el orden correcto de ejecución entre los archivos del proyecto. La validación no puede ejecutarse si antes no se ha generado la tabla resumen de la figura y la generación de la figura depende primero de la descarga y preparación del archivo de datos. Por eso fue importante dejar separadas las etapas del proceso y que cada una produjera una salida clara para la siguiente. De esta manera, el flujo de trabajo quedó </w:t>
-      </w:r>
-      <w:proofErr w:type="gramStart"/>
-      <w:r>
-        <w:rPr>
-          <w:rFonts w:ascii="Times New Roman" w:hAnsi="Times New Roman" w:cs="Times New Roman"/>
-          <w:sz w:val="24"/>
-          <w:szCs w:val="24"/>
-        </w:rPr>
-        <w:t>más organizado y más fácil</w:t>
-      </w:r>
-      <w:proofErr w:type="gramEnd"/>
-      <w:r>
-        <w:rPr>
-          <w:rFonts w:ascii="Times New Roman" w:hAnsi="Times New Roman" w:cs="Times New Roman"/>
-          <w:sz w:val="24"/>
-          <w:szCs w:val="24"/>
-        </w:rPr>
-        <w:t xml:space="preserve"> de revisar dentro del repositorio.</w:t>
+        <w:t>Por último, otro reto fue mantener el orden correcto de ejecución entre los archivos del proyecto. La validación no puede ejecutarse si antes no se ha generado la tabla resumen de la figura y la generación de la figura depende primero de la descarga y preparación del archivo de datos. Por eso fue importante dejar separadas las etapas del proceso y que cada una produjera una salida clara para la siguiente. De esta manera, el flujo de trabajo quedó más organizado y más fácil de revisar dentro del repositorio.</w:t>
       </w:r>
     </w:p>
     <w:p>
@@ -2093,25 +1565,7 @@
           <w:sz w:val="24"/>
           <w:szCs w:val="24"/>
         </w:rPr>
-        <w:t xml:space="preserve">Para evaluar la precisión de la réplica, se comparan las tasas de renuncia reportadas en el estudio original con aquellas obtenidas a partir de los resultados reproducidos. La comparación se basa en el conjunto de resultados agregados utilizado para reconstruir la Figura 2 del artículo, que presenta las tasas de </w:t>
-      </w:r>
-      <w:proofErr w:type="spellStart"/>
-      <w:r>
-        <w:rPr>
-          <w:rFonts w:ascii="Arial" w:hAnsi="Arial" w:cs="Arial"/>
-          <w:sz w:val="24"/>
-          <w:szCs w:val="24"/>
-        </w:rPr>
-        <w:t>attrition</w:t>
-      </w:r>
-      <w:proofErr w:type="spellEnd"/>
-      <w:r>
-        <w:rPr>
-          <w:rFonts w:ascii="Arial" w:hAnsi="Arial" w:cs="Arial"/>
-          <w:sz w:val="24"/>
-          <w:szCs w:val="24"/>
-        </w:rPr>
-        <w:t xml:space="preserve"> (renuncia de empleados) para el grupo de control y el grupo de tratamiento bajo el esquema de trabajo híbrido.</w:t>
+        <w:t>Para evaluar la precisión de la réplica, se comparan las tasas de renuncia reportadas en el estudio original con aquellas obtenidas a partir de los resultados reproducidos. La comparación se basa en el conjunto de resultados agregados utilizado para reconstruir la Figura 2 del artículo, que presenta las tasas de attrition (renuncia de empleados) para el grupo de control y el grupo de tratamiento bajo el esquema de trabajo híbrido.</w:t>
       </w:r>
     </w:p>
     <w:p>
@@ -2324,61 +1778,25 @@
           <w:sz w:val="24"/>
           <w:szCs w:val="24"/>
         </w:rPr>
-        <w:t xml:space="preserve">En segundo lugar, se recalcularon las tasas de </w:t>
-      </w:r>
-      <w:proofErr w:type="spellStart"/>
-      <w:r>
-        <w:rPr>
-          <w:rFonts w:ascii="Arial" w:hAnsi="Arial" w:cs="Arial"/>
-          <w:sz w:val="24"/>
-          <w:szCs w:val="24"/>
-        </w:rPr>
-        <w:t>attrition</w:t>
-      </w:r>
-      <w:proofErr w:type="spellEnd"/>
-      <w:r>
-        <w:rPr>
-          <w:rFonts w:ascii="Arial" w:hAnsi="Arial" w:cs="Arial"/>
-          <w:sz w:val="24"/>
-          <w:szCs w:val="24"/>
-        </w:rPr>
-        <w:t xml:space="preserve"> como el promedio de la variable binaria que indica si un empleado renunció durante el período del experimento. Este procedimiento reproduce exactamente la lógica utilizada para construir la Figura 2 en el artículo original, donde las tasas de renuncia se presentan como proporciones dentro de cada grupo.</w:t>
-      </w:r>
-    </w:p>
-    <w:p>
-      <w:pPr>
-        <w:jc w:val="both"/>
-        <w:rPr>
-          <w:rFonts w:ascii="Arial" w:hAnsi="Arial" w:cs="Arial"/>
-          <w:sz w:val="24"/>
-          <w:szCs w:val="24"/>
-        </w:rPr>
-      </w:pPr>
-      <w:r>
-        <w:rPr>
-          <w:rFonts w:ascii="Arial" w:hAnsi="Arial" w:cs="Arial"/>
-          <w:sz w:val="24"/>
-          <w:szCs w:val="24"/>
-        </w:rPr>
-        <w:t xml:space="preserve">En tercer lugar, se compararon los resultados reproducidos con los valores publicados en el artículo. Para ello se construyó una tabla de validación que reporta las tasas de </w:t>
-      </w:r>
-      <w:proofErr w:type="spellStart"/>
-      <w:r>
-        <w:rPr>
-          <w:rFonts w:ascii="Arial" w:hAnsi="Arial" w:cs="Arial"/>
-          <w:sz w:val="24"/>
-          <w:szCs w:val="24"/>
-        </w:rPr>
-        <w:t>attrition</w:t>
-      </w:r>
-      <w:proofErr w:type="spellEnd"/>
-      <w:r>
-        <w:rPr>
-          <w:rFonts w:ascii="Arial" w:hAnsi="Arial" w:cs="Arial"/>
-          <w:sz w:val="24"/>
-          <w:szCs w:val="24"/>
-        </w:rPr>
-        <w:t xml:space="preserve"> originales, las tasas obtenidas en la réplica y la diferencia entre ambas. El análisis muestra que las discrepancias son mínimas y se encuentran dentro de los márgenes esperados debido a redondeo o precisión numérica.</w:t>
+        <w:t>En segundo lugar, se recalcularon las tasas de attrition como el promedio de la variable binaria que indica si un empleado renunció durante el período del experimento. Este procedimiento reproduce exactamente la lógica utilizada para construir la Figura 2 en el artículo original, donde las tasas de renuncia se presentan como proporciones dentro de cada grupo.</w:t>
+      </w:r>
+    </w:p>
+    <w:p>
+      <w:pPr>
+        <w:jc w:val="both"/>
+        <w:rPr>
+          <w:rFonts w:ascii="Arial" w:hAnsi="Arial" w:cs="Arial"/>
+          <w:sz w:val="24"/>
+          <w:szCs w:val="24"/>
+        </w:rPr>
+      </w:pPr>
+      <w:r>
+        <w:rPr>
+          <w:rFonts w:ascii="Arial" w:hAnsi="Arial" w:cs="Arial"/>
+          <w:sz w:val="24"/>
+          <w:szCs w:val="24"/>
+        </w:rPr>
+        <w:t>En tercer lugar, se compararon los resultados reproducidos con los valores publicados en el artículo. Para ello se construyó una tabla de validación que reporta las tasas de attrition originales, las tasas obtenidas en la réplica y la diferencia entre ambas. El análisis muestra que las discrepancias son mínimas y se encuentran dentro de los márgenes esperados debido a redondeo o precisión numérica.</w:t>
       </w:r>
     </w:p>
     <w:p>
@@ -2527,25 +1945,13 @@
         </w:rPr>
         <w:t xml:space="preserve">El </w:t>
       </w:r>
-      <w:proofErr w:type="spellStart"/>
-      <w:proofErr w:type="gramStart"/>
-      <w:r>
-        <w:rPr>
-          <w:rFonts w:ascii="Arial" w:hAnsi="Arial" w:cs="Arial"/>
-          <w:sz w:val="24"/>
-          <w:szCs w:val="24"/>
-        </w:rPr>
-        <w:t>paper</w:t>
-      </w:r>
-      <w:proofErr w:type="spellEnd"/>
-      <w:proofErr w:type="gramEnd"/>
-      <w:r>
-        <w:rPr>
-          <w:rFonts w:ascii="Arial" w:hAnsi="Arial" w:cs="Arial"/>
-          <w:sz w:val="24"/>
-          <w:szCs w:val="24"/>
-        </w:rPr>
-        <w:t xml:space="preserve"> refleja unos resultados interesantes para el equipo y valiosos para ser replicados</w:t>
+      <w:r>
+        <w:rPr>
+          <w:rFonts w:ascii="Arial" w:hAnsi="Arial" w:cs="Arial"/>
+          <w:sz w:val="24"/>
+          <w:szCs w:val="24"/>
+        </w:rPr>
+        <w:t>paper refleja unos resultados interesantes para el equipo y valiosos para ser replicados</w:t>
       </w:r>
       <w:r>
         <w:rPr>
@@ -2813,18 +2219,8 @@
           <w:sz w:val="24"/>
           <w:szCs w:val="24"/>
         </w:rPr>
-        <w:t xml:space="preserve">Otro desafío importante fue interpretar correctamente las variables incluidas en el </w:t>
-      </w:r>
-      <w:proofErr w:type="spellStart"/>
-      <w:r>
-        <w:rPr>
-          <w:rFonts w:ascii="Arial" w:hAnsi="Arial" w:cs="Arial"/>
-          <w:sz w:val="24"/>
-          <w:szCs w:val="24"/>
-        </w:rPr>
-        <w:t>dataset</w:t>
-      </w:r>
-      <w:proofErr w:type="spellEnd"/>
+        <w:t>Otro desafío importante fue interpretar correctamente las variables incluidas en el dataset</w:t>
+      </w:r>
       <w:r>
         <w:rPr>
           <w:rFonts w:ascii="Arial" w:hAnsi="Arial" w:cs="Arial"/>
@@ -2871,18 +2267,8 @@
           <w:sz w:val="24"/>
           <w:szCs w:val="24"/>
         </w:rPr>
-        <w:t xml:space="preserve">del </w:t>
-      </w:r>
-      <w:proofErr w:type="spellStart"/>
-      <w:r>
-        <w:rPr>
-          <w:rFonts w:ascii="Arial" w:hAnsi="Arial" w:cs="Arial"/>
-          <w:sz w:val="24"/>
-          <w:szCs w:val="24"/>
-        </w:rPr>
-        <w:t>dataset</w:t>
-      </w:r>
-      <w:proofErr w:type="spellEnd"/>
+        <w:t>del dataset</w:t>
+      </w:r>
       <w:r>
         <w:rPr>
           <w:rFonts w:ascii="Arial" w:hAnsi="Arial" w:cs="Arial"/>
@@ -2971,7 +2357,6 @@
         </w:rPr>
         <w:t xml:space="preserve"> de </w:t>
       </w:r>
-      <w:proofErr w:type="spellStart"/>
       <w:r>
         <w:rPr>
           <w:rFonts w:ascii="Arial" w:hAnsi="Arial" w:cs="Arial"/>
@@ -2982,7 +2367,6 @@
         </w:rPr>
         <w:t>attrition</w:t>
       </w:r>
-      <w:proofErr w:type="spellEnd"/>
       <w:r>
         <w:rPr>
           <w:rFonts w:ascii="Arial" w:hAnsi="Arial" w:cs="Arial"/>
@@ -3192,25 +2576,7 @@
           <w:sz w:val="24"/>
           <w:szCs w:val="24"/>
         </w:rPr>
-        <w:t xml:space="preserve"> y especificidad en el </w:t>
-      </w:r>
-      <w:proofErr w:type="spellStart"/>
-      <w:r>
-        <w:rPr>
-          <w:rFonts w:ascii="Arial" w:hAnsi="Arial" w:cs="Arial"/>
-          <w:sz w:val="24"/>
-          <w:szCs w:val="24"/>
-        </w:rPr>
-        <w:t>readme</w:t>
-      </w:r>
-      <w:proofErr w:type="spellEnd"/>
-      <w:r>
-        <w:rPr>
-          <w:rFonts w:ascii="Arial" w:hAnsi="Arial" w:cs="Arial"/>
-          <w:sz w:val="24"/>
-          <w:szCs w:val="24"/>
-        </w:rPr>
-        <w:t xml:space="preserve"> del artículo, para garantizar replicabilidad con los datos.</w:t>
+        <w:t xml:space="preserve"> y especificidad en el readme del artículo, para garantizar replicabilidad con los datos.</w:t>
       </w:r>
     </w:p>
     <w:p>

</xml_diff>